<commit_message>
Kursusvinduer 5.-16. januar og 8.-19. juni, kvarterspot fra oktober 2025
- --end 2026-01-17/2026-06-20 rettet til 2026-01-16/2026-06-19 i README og doc/.
  --end er inklusiv, saa de gamle kommandoer gav 13 doegn mod kursets 12.
- README: spot er kvartersopløst fra 1. oktober 2025, ikke fra 2026.
- README: fodnote om hvorfor Spor A slutter 23. juni.
- Rapport v4: samme to rettelser (afsnit 2.1 og 8.1).
</commit_message>
<xml_diff>
--- a/doc/rapport_billund_v4.docx
+++ b/doc/rapport_billund_v4.docx
@@ -482,7 +482,7 @@
         <w:t xml:space="preserve"> </w:t>
       </w:r>
       <w:r>
-        <w:t xml:space="preserve">Spotprisen time for time (kvarter fra 2026), nettarif pr. tidsbånd og sæson, elafgift og faste tarifled.</w:t>
+        <w:t xml:space="preserve">Spotprisen time for time (kvarterpriser fra 1. oktober 2025), nettarif pr. tidsbånd og sæson, elafgift og faste tarifled.</w:t>
       </w:r>
     </w:p>
     <w:p>
@@ -5017,7 +5017,7 @@
         <w:pStyle w:val="Opstilling-punkttegn"/>
       </w:pPr>
       <w:r>
-        <w:t xml:space="preserve">Kør et kort vindue (fx 5.–17. januar 2026), og tjek, at enhederne kører i den rækkefølge, I kender.</w:t>
+        <w:t xml:space="preserve">Kør et kort vindue (fx 5.–16. januar 2026), og tjek, at enhederne kører i den rækkefølge, I kender.</w:t>
       </w:r>
     </w:p>
     <w:p>

</xml_diff>